<commit_message>
extend to map out months and other templates
</commit_message>
<xml_diff>
--- a/StaffForms/Templates/Weekly Shiftplan {{house}} - {{date}}.docx
+++ b/StaffForms/Templates/Weekly Shiftplan {{house}} - {{date}}.docx
@@ -9,7 +9,6 @@
         <w:keepLines w:val="false"/>
         <w:pageBreakBefore w:val="false"/>
         <w:widowControl/>
-        <w:pBdr/>
         <w:shd w:val="clear" w:fill="auto"/>
         <w:spacing w:lineRule="auto" w:line="276" w:before="0" w:after="200"/>
         <w:ind w:hanging="0" w:start="0" w:end="0"/>
@@ -52,7 +51,28 @@
           <w:shd w:fill="auto" w:val="clear"/>
           <w:vertAlign w:val="baseline"/>
         </w:rPr>
-        <w:t>17 BRANSLEY DAILY SHIFT PLAN</w:t>
+        <w:t>{{house}}</w:t>
+      </w:r>
+      <w:r>
+        <w:rPr>
+          <w:rFonts w:eastAsia="Calibri" w:cs="Calibri"/>
+          <w:b/>
+          <w:bCs/>
+          <w:i w:val="false"/>
+          <w:iCs w:val="false"/>
+          <w:caps w:val="false"/>
+          <w:smallCaps w:val="false"/>
+          <w:strike w:val="false"/>
+          <w:dstrike w:val="false"/>
+          <w:color w:val="000000"/>
+          <w:position w:val="0"/>
+          <w:sz w:val="28"/>
+          <w:szCs w:val="28"/>
+          <w:u w:val="none"/>
+          <w:shd w:fill="auto" w:val="clear"/>
+          <w:vertAlign w:val="baseline"/>
+        </w:rPr>
+        <w:t xml:space="preserve"> BRANSLEY DAILY SHIFT PLAN</w:t>
       </w:r>
     </w:p>
     <w:tbl>
@@ -71,15 +91,15 @@
         <w:tblLook w:val="0000"/>
       </w:tblPr>
       <w:tblGrid>
-        <w:gridCol w:w="2775"/>
-        <w:gridCol w:w="3165"/>
+        <w:gridCol w:w="2774"/>
+        <w:gridCol w:w="3166"/>
         <w:gridCol w:w="3300"/>
       </w:tblGrid>
       <w:tr>
         <w:trPr/>
         <w:tc>
           <w:tcPr>
-            <w:tcW w:w="2775" w:type="dxa"/>
+            <w:tcW w:w="2774" w:type="dxa"/>
             <w:tcBorders>
               <w:top w:val="single" w:sz="4" w:space="0" w:color="000000"/>
               <w:start w:val="single" w:sz="4" w:space="0" w:color="000000"/>
@@ -93,7 +113,6 @@
               <w:keepNext w:val="false"/>
               <w:keepLines w:val="false"/>
               <w:widowControl/>
-              <w:pBdr/>
               <w:shd w:val="clear" w:fill="auto"/>
               <w:spacing w:lineRule="auto" w:line="240" w:before="0" w:after="0"/>
               <w:ind w:hanging="0" w:start="0" w:end="0"/>
@@ -163,7 +182,7 @@
         </w:tc>
         <w:tc>
           <w:tcPr>
-            <w:tcW w:w="3165" w:type="dxa"/>
+            <w:tcW w:w="3166" w:type="dxa"/>
             <w:tcBorders>
               <w:top w:val="single" w:sz="4" w:space="0" w:color="000000"/>
               <w:start w:val="single" w:sz="4" w:space="0" w:color="000000"/>
@@ -177,7 +196,6 @@
               <w:keepNext w:val="false"/>
               <w:keepLines w:val="false"/>
               <w:widowControl/>
-              <w:pBdr/>
               <w:shd w:val="clear" w:fill="auto"/>
               <w:spacing w:lineRule="auto" w:line="240" w:before="0" w:after="0"/>
               <w:ind w:hanging="0" w:start="0" w:end="0"/>
@@ -240,7 +258,6 @@
               <w:keepNext w:val="false"/>
               <w:keepLines w:val="false"/>
               <w:widowControl/>
-              <w:pBdr/>
               <w:shd w:val="clear" w:fill="auto"/>
               <w:spacing w:lineRule="auto" w:line="240" w:before="0" w:after="0"/>
               <w:ind w:hanging="0" w:start="0" w:end="0"/>
@@ -304,49 +321,7 @@
                 <w:shd w:fill="auto" w:val="clear"/>
                 <w:vertAlign w:val="baseline"/>
               </w:rPr>
-              <w:t>{{</w:t>
-            </w:r>
-            <w:r>
-              <w:rPr>
-                <w:rFonts w:eastAsia="Liberation Serif" w:cs="Liberation Serif" w:ascii="Liberation Serif" w:hAnsi="Liberation Serif"/>
-                <w:b w:val="false"/>
-                <w:bCs w:val="false"/>
-                <w:i w:val="false"/>
-                <w:iCs w:val="false"/>
-                <w:caps w:val="false"/>
-                <w:smallCaps w:val="false"/>
-                <w:strike w:val="false"/>
-                <w:dstrike w:val="false"/>
-                <w:color w:val="000000"/>
-                <w:position w:val="0"/>
-                <w:sz w:val="22"/>
-                <w:szCs w:val="22"/>
-                <w:u w:val="none"/>
-                <w:shd w:fill="auto" w:val="clear"/>
-                <w:vertAlign w:val="baseline"/>
-              </w:rPr>
-              <w:t>date</w:t>
-            </w:r>
-            <w:r>
-              <w:rPr>
-                <w:rFonts w:eastAsia="Liberation Serif" w:cs="Liberation Serif" w:ascii="Liberation Serif" w:hAnsi="Liberation Serif"/>
-                <w:b w:val="false"/>
-                <w:bCs w:val="false"/>
-                <w:i w:val="false"/>
-                <w:iCs w:val="false"/>
-                <w:caps w:val="false"/>
-                <w:smallCaps w:val="false"/>
-                <w:strike w:val="false"/>
-                <w:dstrike w:val="false"/>
-                <w:color w:val="000000"/>
-                <w:position w:val="0"/>
-                <w:sz w:val="22"/>
-                <w:szCs w:val="22"/>
-                <w:u w:val="none"/>
-                <w:shd w:fill="auto" w:val="clear"/>
-                <w:vertAlign w:val="baseline"/>
-              </w:rPr>
-              <w:t>}}</w:t>
+              <w:t>{{date}}</w:t>
             </w:r>
           </w:p>
         </w:tc>
@@ -373,7 +348,6 @@
               <w:keepNext w:val="false"/>
               <w:keepLines w:val="false"/>
               <w:widowControl/>
-              <w:pBdr/>
               <w:shd w:val="clear" w:fill="auto"/>
               <w:spacing w:lineRule="auto" w:line="240" w:before="0" w:after="0"/>
               <w:ind w:hanging="0" w:start="0" w:end="0"/>
@@ -425,7 +399,6 @@
               <w:keepNext w:val="false"/>
               <w:keepLines w:val="false"/>
               <w:widowControl/>
-              <w:pBdr/>
               <w:shd w:val="clear" w:fill="auto"/>
               <w:spacing w:lineRule="auto" w:line="240" w:before="0" w:after="0"/>
               <w:ind w:hanging="0" w:start="0" w:end="0"/>
@@ -494,7 +467,6 @@
               <w:keepNext w:val="false"/>
               <w:keepLines w:val="false"/>
               <w:widowControl/>
-              <w:pBdr/>
               <w:shd w:val="clear" w:fill="auto"/>
               <w:spacing w:lineRule="auto" w:line="276" w:before="0" w:after="200"/>
               <w:ind w:hanging="0" w:start="0" w:end="0"/>
@@ -545,7 +517,6 @@
               <w:keepNext w:val="false"/>
               <w:keepLines w:val="false"/>
               <w:widowControl/>
-              <w:pBdr/>
               <w:shd w:val="clear" w:fill="auto"/>
               <w:spacing w:lineRule="auto" w:line="276" w:before="0" w:after="200"/>
               <w:ind w:hanging="0" w:start="0" w:end="0"/>
@@ -596,7 +567,6 @@
               <w:keepNext w:val="false"/>
               <w:keepLines w:val="false"/>
               <w:widowControl/>
-              <w:pBdr/>
               <w:shd w:val="clear" w:fill="auto"/>
               <w:spacing w:lineRule="auto" w:line="276" w:before="0" w:after="200"/>
               <w:ind w:hanging="0" w:start="0" w:end="0"/>
@@ -651,7 +621,6 @@
         <w:keepLines w:val="false"/>
         <w:pageBreakBefore w:val="false"/>
         <w:widowControl/>
-        <w:pBdr/>
         <w:shd w:val="clear" w:fill="auto"/>
         <w:spacing w:lineRule="auto" w:line="276" w:before="0" w:after="200"/>
         <w:ind w:hanging="0" w:start="0" w:end="0"/>
@@ -714,15 +683,15 @@
         <w:tblLook w:val="0000"/>
       </w:tblPr>
       <w:tblGrid>
-        <w:gridCol w:w="2715"/>
+        <w:gridCol w:w="2714"/>
         <w:gridCol w:w="2745"/>
-        <w:gridCol w:w="3780"/>
+        <w:gridCol w:w="3781"/>
       </w:tblGrid>
       <w:tr>
         <w:trPr/>
         <w:tc>
           <w:tcPr>
-            <w:tcW w:w="2715" w:type="dxa"/>
+            <w:tcW w:w="2714" w:type="dxa"/>
             <w:tcBorders>
               <w:top w:val="single" w:sz="4" w:space="0" w:color="000000"/>
               <w:start w:val="single" w:sz="4" w:space="0" w:color="000000"/>
@@ -736,7 +705,6 @@
               <w:keepNext w:val="false"/>
               <w:keepLines w:val="false"/>
               <w:widowControl/>
-              <w:pBdr/>
               <w:shd w:val="clear" w:fill="auto"/>
               <w:spacing w:lineRule="auto" w:line="240" w:before="0" w:after="0"/>
               <w:ind w:hanging="0" w:start="0" w:end="0"/>
@@ -820,7 +788,6 @@
               <w:keepNext w:val="false"/>
               <w:keepLines w:val="false"/>
               <w:widowControl/>
-              <w:pBdr/>
               <w:shd w:val="clear" w:fill="auto"/>
               <w:spacing w:lineRule="auto" w:line="240" w:before="0" w:after="0"/>
               <w:ind w:hanging="0" w:start="0" w:end="0"/>
@@ -863,34 +830,13 @@
                 <w:shd w:fill="auto" w:val="clear"/>
                 <w:vertAlign w:val="baseline"/>
               </w:rPr>
-              <w:t xml:space="preserve">Day: </w:t>
-            </w:r>
-            <w:r>
-              <w:rPr>
-                <w:rFonts w:eastAsia="Calibri" w:cs="Calibri"/>
-                <w:b/>
-                <w:bCs/>
-                <w:i w:val="false"/>
-                <w:iCs w:val="false"/>
-                <w:caps w:val="false"/>
-                <w:smallCaps w:val="false"/>
-                <w:strike w:val="false"/>
-                <w:dstrike w:val="false"/>
-                <w:color w:val="000000"/>
-                <w:position w:val="0"/>
-                <w:sz w:val="28"/>
-                <w:szCs w:val="28"/>
-                <w:u w:val="none"/>
-                <w:shd w:fill="auto" w:val="clear"/>
-                <w:vertAlign w:val="baseline"/>
-              </w:rPr>
-              <w:t>Tuesday</w:t>
+              <w:t>Day: Tuesday</w:t>
             </w:r>
           </w:p>
         </w:tc>
         <w:tc>
           <w:tcPr>
-            <w:tcW w:w="3780" w:type="dxa"/>
+            <w:tcW w:w="3781" w:type="dxa"/>
             <w:tcBorders>
               <w:top w:val="single" w:sz="4" w:space="0" w:color="000000"/>
               <w:start w:val="single" w:sz="4" w:space="0" w:color="000000"/>
@@ -904,7 +850,6 @@
               <w:keepNext w:val="false"/>
               <w:keepLines w:val="false"/>
               <w:widowControl/>
-              <w:pBdr/>
               <w:shd w:val="clear" w:fill="auto"/>
               <w:spacing w:lineRule="auto" w:line="240" w:before="0" w:after="0"/>
               <w:ind w:hanging="0" w:start="0" w:end="0"/>
@@ -968,49 +913,7 @@
                 <w:shd w:fill="auto" w:val="clear"/>
                 <w:vertAlign w:val="baseline"/>
               </w:rPr>
-              <w:t>{{</w:t>
-            </w:r>
-            <w:r>
-              <w:rPr>
-                <w:rFonts w:eastAsia="Liberation Serif" w:cs="Liberation Serif" w:ascii="Liberation Serif" w:hAnsi="Liberation Serif"/>
-                <w:b w:val="false"/>
-                <w:bCs w:val="false"/>
-                <w:i w:val="false"/>
-                <w:iCs w:val="false"/>
-                <w:caps w:val="false"/>
-                <w:smallCaps w:val="false"/>
-                <w:strike w:val="false"/>
-                <w:dstrike w:val="false"/>
-                <w:color w:val="000000"/>
-                <w:position w:val="0"/>
-                <w:sz w:val="22"/>
-                <w:szCs w:val="22"/>
-                <w:u w:val="none"/>
-                <w:shd w:fill="auto" w:val="clear"/>
-                <w:vertAlign w:val="baseline"/>
-              </w:rPr>
-              <w:t>date</w:t>
-            </w:r>
-            <w:r>
-              <w:rPr>
-                <w:rFonts w:eastAsia="Liberation Serif" w:cs="Liberation Serif" w:ascii="Liberation Serif" w:hAnsi="Liberation Serif"/>
-                <w:b w:val="false"/>
-                <w:bCs w:val="false"/>
-                <w:i w:val="false"/>
-                <w:iCs w:val="false"/>
-                <w:caps w:val="false"/>
-                <w:smallCaps w:val="false"/>
-                <w:strike w:val="false"/>
-                <w:dstrike w:val="false"/>
-                <w:color w:val="000000"/>
-                <w:position w:val="0"/>
-                <w:sz w:val="22"/>
-                <w:szCs w:val="22"/>
-                <w:u w:val="none"/>
-                <w:shd w:fill="auto" w:val="clear"/>
-                <w:vertAlign w:val="baseline"/>
-              </w:rPr>
-              <w:t>}}</w:t>
+              <w:t>{{date}}</w:t>
             </w:r>
           </w:p>
         </w:tc>
@@ -1197,15 +1100,15 @@
         <w:tblLook w:val="0000"/>
       </w:tblPr>
       <w:tblGrid>
-        <w:gridCol w:w="2775"/>
+        <w:gridCol w:w="2774"/>
         <w:gridCol w:w="2685"/>
-        <w:gridCol w:w="3780"/>
+        <w:gridCol w:w="3781"/>
       </w:tblGrid>
       <w:tr>
         <w:trPr/>
         <w:tc>
           <w:tcPr>
-            <w:tcW w:w="2775" w:type="dxa"/>
+            <w:tcW w:w="2774" w:type="dxa"/>
             <w:tcBorders>
               <w:top w:val="single" w:sz="4" w:space="0" w:color="000000"/>
               <w:start w:val="single" w:sz="4" w:space="0" w:color="000000"/>
@@ -1219,7 +1122,6 @@
               <w:keepNext w:val="false"/>
               <w:keepLines w:val="false"/>
               <w:widowControl/>
-              <w:pBdr/>
               <w:shd w:val="clear" w:fill="auto"/>
               <w:spacing w:lineRule="auto" w:line="240" w:before="0" w:after="0"/>
               <w:ind w:hanging="0" w:start="0" w:end="0"/>
@@ -1303,7 +1205,6 @@
               <w:keepNext w:val="false"/>
               <w:keepLines w:val="false"/>
               <w:widowControl/>
-              <w:pBdr/>
               <w:shd w:val="clear" w:fill="auto"/>
               <w:spacing w:lineRule="auto" w:line="240" w:before="0" w:after="0"/>
               <w:ind w:hanging="0" w:start="0" w:end="0"/>
@@ -1346,34 +1247,13 @@
                 <w:shd w:fill="auto" w:val="clear"/>
                 <w:vertAlign w:val="baseline"/>
               </w:rPr>
-              <w:t>Day:</w:t>
-            </w:r>
-            <w:r>
-              <w:rPr>
-                <w:rFonts w:eastAsia="Calibri" w:cs="Calibri"/>
-                <w:b/>
-                <w:bCs/>
-                <w:i w:val="false"/>
-                <w:iCs w:val="false"/>
-                <w:caps w:val="false"/>
-                <w:smallCaps w:val="false"/>
-                <w:strike w:val="false"/>
-                <w:dstrike w:val="false"/>
-                <w:color w:val="000000"/>
-                <w:position w:val="0"/>
-                <w:sz w:val="28"/>
-                <w:szCs w:val="28"/>
-                <w:u w:val="none"/>
-                <w:shd w:fill="auto" w:val="clear"/>
-                <w:vertAlign w:val="baseline"/>
-              </w:rPr>
-              <w:t xml:space="preserve"> Wednesday</w:t>
+              <w:t>Day: Wednesday</w:t>
             </w:r>
           </w:p>
         </w:tc>
         <w:tc>
           <w:tcPr>
-            <w:tcW w:w="3780" w:type="dxa"/>
+            <w:tcW w:w="3781" w:type="dxa"/>
             <w:tcBorders>
               <w:top w:val="single" w:sz="4" w:space="0" w:color="000000"/>
               <w:start w:val="single" w:sz="4" w:space="0" w:color="000000"/>
@@ -1387,7 +1267,6 @@
               <w:keepNext w:val="false"/>
               <w:keepLines w:val="false"/>
               <w:widowControl/>
-              <w:pBdr/>
               <w:shd w:val="clear" w:fill="auto"/>
               <w:spacing w:lineRule="auto" w:line="240" w:before="0" w:after="0"/>
               <w:ind w:hanging="0" w:start="0" w:end="0"/>
@@ -1451,49 +1330,7 @@
                 <w:shd w:fill="auto" w:val="clear"/>
                 <w:vertAlign w:val="baseline"/>
               </w:rPr>
-              <w:t>{{</w:t>
-            </w:r>
-            <w:r>
-              <w:rPr>
-                <w:rFonts w:eastAsia="Liberation Serif" w:cs="Liberation Serif" w:ascii="Liberation Serif" w:hAnsi="Liberation Serif"/>
-                <w:b w:val="false"/>
-                <w:bCs w:val="false"/>
-                <w:i w:val="false"/>
-                <w:iCs w:val="false"/>
-                <w:caps w:val="false"/>
-                <w:smallCaps w:val="false"/>
-                <w:strike w:val="false"/>
-                <w:dstrike w:val="false"/>
-                <w:color w:val="000000"/>
-                <w:position w:val="0"/>
-                <w:sz w:val="22"/>
-                <w:szCs w:val="22"/>
-                <w:u w:val="none"/>
-                <w:shd w:fill="auto" w:val="clear"/>
-                <w:vertAlign w:val="baseline"/>
-              </w:rPr>
-              <w:t>date</w:t>
-            </w:r>
-            <w:r>
-              <w:rPr>
-                <w:rFonts w:eastAsia="Liberation Serif" w:cs="Liberation Serif" w:ascii="Liberation Serif" w:hAnsi="Liberation Serif"/>
-                <w:b w:val="false"/>
-                <w:bCs w:val="false"/>
-                <w:i w:val="false"/>
-                <w:iCs w:val="false"/>
-                <w:caps w:val="false"/>
-                <w:smallCaps w:val="false"/>
-                <w:strike w:val="false"/>
-                <w:dstrike w:val="false"/>
-                <w:color w:val="000000"/>
-                <w:position w:val="0"/>
-                <w:sz w:val="22"/>
-                <w:szCs w:val="22"/>
-                <w:u w:val="none"/>
-                <w:shd w:fill="auto" w:val="clear"/>
-                <w:vertAlign w:val="baseline"/>
-              </w:rPr>
-              <w:t>}}</w:t>
+              <w:t>{{date}}</w:t>
             </w:r>
           </w:p>
         </w:tc>
@@ -1680,15 +1517,15 @@
         <w:tblLook w:val="0000"/>
       </w:tblPr>
       <w:tblGrid>
-        <w:gridCol w:w="2715"/>
+        <w:gridCol w:w="2714"/>
         <w:gridCol w:w="2745"/>
-        <w:gridCol w:w="3780"/>
+        <w:gridCol w:w="3781"/>
       </w:tblGrid>
       <w:tr>
         <w:trPr/>
         <w:tc>
           <w:tcPr>
-            <w:tcW w:w="2715" w:type="dxa"/>
+            <w:tcW w:w="2714" w:type="dxa"/>
             <w:tcBorders>
               <w:top w:val="single" w:sz="4" w:space="0" w:color="000000"/>
               <w:start w:val="single" w:sz="4" w:space="0" w:color="000000"/>
@@ -1702,7 +1539,6 @@
               <w:keepNext w:val="false"/>
               <w:keepLines w:val="false"/>
               <w:widowControl/>
-              <w:pBdr/>
               <w:shd w:val="clear" w:fill="auto"/>
               <w:spacing w:lineRule="auto" w:line="240" w:before="0" w:after="0"/>
               <w:ind w:hanging="0" w:start="0" w:end="0"/>
@@ -1786,7 +1622,6 @@
               <w:keepNext w:val="false"/>
               <w:keepLines w:val="false"/>
               <w:widowControl/>
-              <w:pBdr/>
               <w:shd w:val="clear" w:fill="auto"/>
               <w:spacing w:lineRule="auto" w:line="240" w:before="0" w:after="0"/>
               <w:ind w:hanging="0" w:start="0" w:end="0"/>
@@ -1829,34 +1664,13 @@
                 <w:shd w:fill="auto" w:val="clear"/>
                 <w:vertAlign w:val="baseline"/>
               </w:rPr>
-              <w:t xml:space="preserve">Day: </w:t>
-            </w:r>
-            <w:r>
-              <w:rPr>
-                <w:rFonts w:eastAsia="Calibri" w:cs="Calibri"/>
-                <w:b/>
-                <w:bCs/>
-                <w:i w:val="false"/>
-                <w:iCs w:val="false"/>
-                <w:caps w:val="false"/>
-                <w:smallCaps w:val="false"/>
-                <w:strike w:val="false"/>
-                <w:dstrike w:val="false"/>
-                <w:color w:val="000000"/>
-                <w:position w:val="0"/>
-                <w:sz w:val="28"/>
-                <w:szCs w:val="28"/>
-                <w:u w:val="none"/>
-                <w:shd w:fill="auto" w:val="clear"/>
-                <w:vertAlign w:val="baseline"/>
-              </w:rPr>
-              <w:t>Thursday</w:t>
+              <w:t>Day: Thursday</w:t>
             </w:r>
           </w:p>
         </w:tc>
         <w:tc>
           <w:tcPr>
-            <w:tcW w:w="3780" w:type="dxa"/>
+            <w:tcW w:w="3781" w:type="dxa"/>
             <w:tcBorders>
               <w:top w:val="single" w:sz="4" w:space="0" w:color="000000"/>
               <w:start w:val="single" w:sz="4" w:space="0" w:color="000000"/>
@@ -1870,7 +1684,6 @@
               <w:keepNext w:val="false"/>
               <w:keepLines w:val="false"/>
               <w:widowControl/>
-              <w:pBdr/>
               <w:shd w:val="clear" w:fill="auto"/>
               <w:spacing w:lineRule="auto" w:line="240" w:before="0" w:after="0"/>
               <w:ind w:hanging="0" w:start="0" w:end="0"/>
@@ -1934,49 +1747,7 @@
                 <w:shd w:fill="auto" w:val="clear"/>
                 <w:vertAlign w:val="baseline"/>
               </w:rPr>
-              <w:t>{{</w:t>
-            </w:r>
-            <w:r>
-              <w:rPr>
-                <w:rFonts w:eastAsia="Liberation Serif" w:cs="Liberation Serif" w:ascii="Liberation Serif" w:hAnsi="Liberation Serif"/>
-                <w:b w:val="false"/>
-                <w:bCs w:val="false"/>
-                <w:i w:val="false"/>
-                <w:iCs w:val="false"/>
-                <w:caps w:val="false"/>
-                <w:smallCaps w:val="false"/>
-                <w:strike w:val="false"/>
-                <w:dstrike w:val="false"/>
-                <w:color w:val="000000"/>
-                <w:position w:val="0"/>
-                <w:sz w:val="22"/>
-                <w:szCs w:val="22"/>
-                <w:u w:val="none"/>
-                <w:shd w:fill="auto" w:val="clear"/>
-                <w:vertAlign w:val="baseline"/>
-              </w:rPr>
-              <w:t>date</w:t>
-            </w:r>
-            <w:r>
-              <w:rPr>
-                <w:rFonts w:eastAsia="Liberation Serif" w:cs="Liberation Serif" w:ascii="Liberation Serif" w:hAnsi="Liberation Serif"/>
-                <w:b w:val="false"/>
-                <w:bCs w:val="false"/>
-                <w:i w:val="false"/>
-                <w:iCs w:val="false"/>
-                <w:caps w:val="false"/>
-                <w:smallCaps w:val="false"/>
-                <w:strike w:val="false"/>
-                <w:dstrike w:val="false"/>
-                <w:color w:val="000000"/>
-                <w:position w:val="0"/>
-                <w:sz w:val="22"/>
-                <w:szCs w:val="22"/>
-                <w:u w:val="none"/>
-                <w:shd w:fill="auto" w:val="clear"/>
-                <w:vertAlign w:val="baseline"/>
-              </w:rPr>
-              <w:t>}}</w:t>
+              <w:t>{{date}}</w:t>
             </w:r>
           </w:p>
         </w:tc>
@@ -2164,8 +1935,8 @@
       </w:tblPr>
       <w:tblGrid>
         <w:gridCol w:w="3000"/>
-        <w:gridCol w:w="2460"/>
-        <w:gridCol w:w="3780"/>
+        <w:gridCol w:w="2459"/>
+        <w:gridCol w:w="3781"/>
       </w:tblGrid>
       <w:tr>
         <w:trPr/>
@@ -2185,7 +1956,6 @@
               <w:keepNext w:val="false"/>
               <w:keepLines w:val="false"/>
               <w:widowControl/>
-              <w:pBdr/>
               <w:shd w:val="clear" w:fill="auto"/>
               <w:spacing w:lineRule="auto" w:line="240" w:before="0" w:after="0"/>
               <w:ind w:hanging="0" w:start="0" w:end="0"/>
@@ -2255,7 +2025,7 @@
         </w:tc>
         <w:tc>
           <w:tcPr>
-            <w:tcW w:w="2460" w:type="dxa"/>
+            <w:tcW w:w="2459" w:type="dxa"/>
             <w:tcBorders>
               <w:top w:val="single" w:sz="4" w:space="0" w:color="000000"/>
               <w:start w:val="single" w:sz="4" w:space="0" w:color="000000"/>
@@ -2269,7 +2039,6 @@
               <w:keepNext w:val="false"/>
               <w:keepLines w:val="false"/>
               <w:widowControl/>
-              <w:pBdr/>
               <w:shd w:val="clear" w:fill="auto"/>
               <w:spacing w:lineRule="auto" w:line="240" w:before="0" w:after="0"/>
               <w:ind w:hanging="0" w:start="0" w:end="0"/>
@@ -2312,34 +2081,13 @@
                 <w:shd w:fill="auto" w:val="clear"/>
                 <w:vertAlign w:val="baseline"/>
               </w:rPr>
-              <w:t xml:space="preserve">Day: </w:t>
-            </w:r>
-            <w:r>
-              <w:rPr>
-                <w:rFonts w:eastAsia="Calibri" w:cs="Calibri"/>
-                <w:b/>
-                <w:bCs/>
-                <w:i w:val="false"/>
-                <w:iCs w:val="false"/>
-                <w:caps w:val="false"/>
-                <w:smallCaps w:val="false"/>
-                <w:strike w:val="false"/>
-                <w:dstrike w:val="false"/>
-                <w:color w:val="000000"/>
-                <w:position w:val="0"/>
-                <w:sz w:val="28"/>
-                <w:szCs w:val="28"/>
-                <w:u w:val="none"/>
-                <w:shd w:fill="auto" w:val="clear"/>
-                <w:vertAlign w:val="baseline"/>
-              </w:rPr>
-              <w:t>Friday</w:t>
+              <w:t>Day: Friday</w:t>
             </w:r>
           </w:p>
         </w:tc>
         <w:tc>
           <w:tcPr>
-            <w:tcW w:w="3780" w:type="dxa"/>
+            <w:tcW w:w="3781" w:type="dxa"/>
             <w:tcBorders>
               <w:top w:val="single" w:sz="4" w:space="0" w:color="000000"/>
               <w:start w:val="single" w:sz="4" w:space="0" w:color="000000"/>
@@ -2353,7 +2101,6 @@
               <w:keepNext w:val="false"/>
               <w:keepLines w:val="false"/>
               <w:widowControl/>
-              <w:pBdr/>
               <w:shd w:val="clear" w:fill="auto"/>
               <w:spacing w:lineRule="auto" w:line="240" w:before="0" w:after="0"/>
               <w:ind w:hanging="0" w:start="0" w:end="0"/>
@@ -2417,49 +2164,7 @@
                 <w:shd w:fill="auto" w:val="clear"/>
                 <w:vertAlign w:val="baseline"/>
               </w:rPr>
-              <w:t>{{</w:t>
-            </w:r>
-            <w:r>
-              <w:rPr>
-                <w:rFonts w:eastAsia="Liberation Serif" w:cs="Liberation Serif" w:ascii="Liberation Serif" w:hAnsi="Liberation Serif"/>
-                <w:b w:val="false"/>
-                <w:bCs w:val="false"/>
-                <w:i w:val="false"/>
-                <w:iCs w:val="false"/>
-                <w:caps w:val="false"/>
-                <w:smallCaps w:val="false"/>
-                <w:strike w:val="false"/>
-                <w:dstrike w:val="false"/>
-                <w:color w:val="000000"/>
-                <w:position w:val="0"/>
-                <w:sz w:val="22"/>
-                <w:szCs w:val="22"/>
-                <w:u w:val="none"/>
-                <w:shd w:fill="auto" w:val="clear"/>
-                <w:vertAlign w:val="baseline"/>
-              </w:rPr>
-              <w:t>date</w:t>
-            </w:r>
-            <w:r>
-              <w:rPr>
-                <w:rFonts w:eastAsia="Liberation Serif" w:cs="Liberation Serif" w:ascii="Liberation Serif" w:hAnsi="Liberation Serif"/>
-                <w:b w:val="false"/>
-                <w:bCs w:val="false"/>
-                <w:i w:val="false"/>
-                <w:iCs w:val="false"/>
-                <w:caps w:val="false"/>
-                <w:smallCaps w:val="false"/>
-                <w:strike w:val="false"/>
-                <w:dstrike w:val="false"/>
-                <w:color w:val="000000"/>
-                <w:position w:val="0"/>
-                <w:sz w:val="22"/>
-                <w:szCs w:val="22"/>
-                <w:u w:val="none"/>
-                <w:shd w:fill="auto" w:val="clear"/>
-                <w:vertAlign w:val="baseline"/>
-              </w:rPr>
-              <w:t>}}</w:t>
+              <w:t>{{date}}</w:t>
             </w:r>
           </w:p>
         </w:tc>
@@ -2642,15 +2347,15 @@
         <w:tblLook w:val="0000"/>
       </w:tblPr>
       <w:tblGrid>
-        <w:gridCol w:w="2775"/>
+        <w:gridCol w:w="2774"/>
         <w:gridCol w:w="2685"/>
-        <w:gridCol w:w="3780"/>
+        <w:gridCol w:w="3781"/>
       </w:tblGrid>
       <w:tr>
         <w:trPr/>
         <w:tc>
           <w:tcPr>
-            <w:tcW w:w="2775" w:type="dxa"/>
+            <w:tcW w:w="2774" w:type="dxa"/>
             <w:tcBorders>
               <w:top w:val="single" w:sz="4" w:space="0" w:color="000000"/>
               <w:start w:val="single" w:sz="4" w:space="0" w:color="000000"/>
@@ -2664,7 +2369,6 @@
               <w:keepNext w:val="false"/>
               <w:keepLines w:val="false"/>
               <w:widowControl/>
-              <w:pBdr/>
               <w:shd w:val="clear" w:fill="auto"/>
               <w:spacing w:lineRule="auto" w:line="240" w:before="0" w:after="0"/>
               <w:ind w:hanging="0" w:start="0" w:end="0"/>
@@ -2748,7 +2452,6 @@
               <w:keepNext w:val="false"/>
               <w:keepLines w:val="false"/>
               <w:widowControl/>
-              <w:pBdr/>
               <w:shd w:val="clear" w:fill="auto"/>
               <w:spacing w:lineRule="auto" w:line="240" w:before="0" w:after="0"/>
               <w:ind w:hanging="0" w:start="0" w:end="0"/>
@@ -2791,34 +2494,13 @@
                 <w:shd w:fill="auto" w:val="clear"/>
                 <w:vertAlign w:val="baseline"/>
               </w:rPr>
-              <w:t xml:space="preserve">Day: </w:t>
-            </w:r>
-            <w:r>
-              <w:rPr>
-                <w:rFonts w:eastAsia="Calibri" w:cs="Calibri"/>
-                <w:b/>
-                <w:bCs/>
-                <w:i w:val="false"/>
-                <w:iCs w:val="false"/>
-                <w:caps w:val="false"/>
-                <w:smallCaps w:val="false"/>
-                <w:strike w:val="false"/>
-                <w:dstrike w:val="false"/>
-                <w:color w:val="000000"/>
-                <w:position w:val="0"/>
-                <w:sz w:val="28"/>
-                <w:szCs w:val="28"/>
-                <w:u w:val="none"/>
-                <w:shd w:fill="auto" w:val="clear"/>
-                <w:vertAlign w:val="baseline"/>
-              </w:rPr>
-              <w:t>Saturday</w:t>
+              <w:t>Day: Saturday</w:t>
             </w:r>
           </w:p>
         </w:tc>
         <w:tc>
           <w:tcPr>
-            <w:tcW w:w="3780" w:type="dxa"/>
+            <w:tcW w:w="3781" w:type="dxa"/>
             <w:tcBorders>
               <w:top w:val="single" w:sz="4" w:space="0" w:color="000000"/>
               <w:start w:val="single" w:sz="4" w:space="0" w:color="000000"/>
@@ -2832,7 +2514,6 @@
               <w:keepNext w:val="false"/>
               <w:keepLines w:val="false"/>
               <w:widowControl/>
-              <w:pBdr/>
               <w:shd w:val="clear" w:fill="auto"/>
               <w:spacing w:lineRule="auto" w:line="240" w:before="0" w:after="0"/>
               <w:ind w:hanging="0" w:start="0" w:end="0"/>
@@ -2896,49 +2577,7 @@
                 <w:shd w:fill="auto" w:val="clear"/>
                 <w:vertAlign w:val="baseline"/>
               </w:rPr>
-              <w:t>{{</w:t>
-            </w:r>
-            <w:r>
-              <w:rPr>
-                <w:rFonts w:eastAsia="Liberation Serif" w:cs="Liberation Serif" w:ascii="Liberation Serif" w:hAnsi="Liberation Serif"/>
-                <w:b w:val="false"/>
-                <w:bCs w:val="false"/>
-                <w:i w:val="false"/>
-                <w:iCs w:val="false"/>
-                <w:caps w:val="false"/>
-                <w:smallCaps w:val="false"/>
-                <w:strike w:val="false"/>
-                <w:dstrike w:val="false"/>
-                <w:color w:val="000000"/>
-                <w:position w:val="0"/>
-                <w:sz w:val="22"/>
-                <w:szCs w:val="22"/>
-                <w:u w:val="none"/>
-                <w:shd w:fill="auto" w:val="clear"/>
-                <w:vertAlign w:val="baseline"/>
-              </w:rPr>
-              <w:t>date</w:t>
-            </w:r>
-            <w:r>
-              <w:rPr>
-                <w:rFonts w:eastAsia="Liberation Serif" w:cs="Liberation Serif" w:ascii="Liberation Serif" w:hAnsi="Liberation Serif"/>
-                <w:b w:val="false"/>
-                <w:bCs w:val="false"/>
-                <w:i w:val="false"/>
-                <w:iCs w:val="false"/>
-                <w:caps w:val="false"/>
-                <w:smallCaps w:val="false"/>
-                <w:strike w:val="false"/>
-                <w:dstrike w:val="false"/>
-                <w:color w:val="000000"/>
-                <w:position w:val="0"/>
-                <w:sz w:val="22"/>
-                <w:szCs w:val="22"/>
-                <w:u w:val="none"/>
-                <w:shd w:fill="auto" w:val="clear"/>
-                <w:vertAlign w:val="baseline"/>
-              </w:rPr>
-              <w:t>}}</w:t>
+              <w:t>{{date}}</w:t>
             </w:r>
           </w:p>
         </w:tc>
@@ -3122,8 +2761,8 @@
       </w:tblPr>
       <w:tblGrid>
         <w:gridCol w:w="2820"/>
-        <w:gridCol w:w="2640"/>
-        <w:gridCol w:w="3780"/>
+        <w:gridCol w:w="2639"/>
+        <w:gridCol w:w="3781"/>
       </w:tblGrid>
       <w:tr>
         <w:trPr/>
@@ -3143,7 +2782,6 @@
               <w:keepNext w:val="false"/>
               <w:keepLines w:val="false"/>
               <w:widowControl/>
-              <w:pBdr/>
               <w:shd w:val="clear" w:fill="auto"/>
               <w:spacing w:lineRule="auto" w:line="240" w:before="0" w:after="0"/>
               <w:ind w:hanging="0" w:start="0" w:end="0"/>
@@ -3213,7 +2851,7 @@
         </w:tc>
         <w:tc>
           <w:tcPr>
-            <w:tcW w:w="2640" w:type="dxa"/>
+            <w:tcW w:w="2639" w:type="dxa"/>
             <w:tcBorders>
               <w:top w:val="single" w:sz="4" w:space="0" w:color="000000"/>
               <w:start w:val="single" w:sz="4" w:space="0" w:color="000000"/>
@@ -3227,7 +2865,6 @@
               <w:keepNext w:val="false"/>
               <w:keepLines w:val="false"/>
               <w:widowControl/>
-              <w:pBdr/>
               <w:shd w:val="clear" w:fill="auto"/>
               <w:spacing w:lineRule="auto" w:line="240" w:before="0" w:after="0"/>
               <w:ind w:hanging="0" w:start="0" w:end="0"/>
@@ -3270,34 +2907,13 @@
                 <w:shd w:fill="auto" w:val="clear"/>
                 <w:vertAlign w:val="baseline"/>
               </w:rPr>
-              <w:t xml:space="preserve">Day: </w:t>
-            </w:r>
-            <w:r>
-              <w:rPr>
-                <w:rFonts w:eastAsia="Calibri" w:cs="Calibri"/>
-                <w:b/>
-                <w:bCs/>
-                <w:i w:val="false"/>
-                <w:iCs w:val="false"/>
-                <w:caps w:val="false"/>
-                <w:smallCaps w:val="false"/>
-                <w:strike w:val="false"/>
-                <w:dstrike w:val="false"/>
-                <w:color w:val="000000"/>
-                <w:position w:val="0"/>
-                <w:sz w:val="28"/>
-                <w:szCs w:val="28"/>
-                <w:u w:val="none"/>
-                <w:shd w:fill="auto" w:val="clear"/>
-                <w:vertAlign w:val="baseline"/>
-              </w:rPr>
-              <w:t>Sunday</w:t>
+              <w:t>Day: Sunday</w:t>
             </w:r>
           </w:p>
         </w:tc>
         <w:tc>
           <w:tcPr>
-            <w:tcW w:w="3780" w:type="dxa"/>
+            <w:tcW w:w="3781" w:type="dxa"/>
             <w:tcBorders>
               <w:top w:val="single" w:sz="4" w:space="0" w:color="000000"/>
               <w:start w:val="single" w:sz="4" w:space="0" w:color="000000"/>
@@ -3311,7 +2927,6 @@
               <w:keepNext w:val="false"/>
               <w:keepLines w:val="false"/>
               <w:widowControl/>
-              <w:pBdr/>
               <w:shd w:val="clear" w:fill="auto"/>
               <w:spacing w:lineRule="auto" w:line="240" w:before="0" w:after="0"/>
               <w:ind w:hanging="0" w:start="0" w:end="0"/>
@@ -3375,49 +2990,7 @@
                 <w:shd w:fill="auto" w:val="clear"/>
                 <w:vertAlign w:val="baseline"/>
               </w:rPr>
-              <w:t>{{</w:t>
-            </w:r>
-            <w:r>
-              <w:rPr>
-                <w:rFonts w:eastAsia="Liberation Serif" w:cs="Liberation Serif" w:ascii="Liberation Serif" w:hAnsi="Liberation Serif"/>
-                <w:b w:val="false"/>
-                <w:bCs w:val="false"/>
-                <w:i w:val="false"/>
-                <w:iCs w:val="false"/>
-                <w:caps w:val="false"/>
-                <w:smallCaps w:val="false"/>
-                <w:strike w:val="false"/>
-                <w:dstrike w:val="false"/>
-                <w:color w:val="000000"/>
-                <w:position w:val="0"/>
-                <w:sz w:val="22"/>
-                <w:szCs w:val="22"/>
-                <w:u w:val="none"/>
-                <w:shd w:fill="auto" w:val="clear"/>
-                <w:vertAlign w:val="baseline"/>
-              </w:rPr>
-              <w:t>date</w:t>
-            </w:r>
-            <w:r>
-              <w:rPr>
-                <w:rFonts w:eastAsia="Liberation Serif" w:cs="Liberation Serif" w:ascii="Liberation Serif" w:hAnsi="Liberation Serif"/>
-                <w:b w:val="false"/>
-                <w:bCs w:val="false"/>
-                <w:i w:val="false"/>
-                <w:iCs w:val="false"/>
-                <w:caps w:val="false"/>
-                <w:smallCaps w:val="false"/>
-                <w:strike w:val="false"/>
-                <w:dstrike w:val="false"/>
-                <w:color w:val="000000"/>
-                <w:position w:val="0"/>
-                <w:sz w:val="22"/>
-                <w:szCs w:val="22"/>
-                <w:u w:val="none"/>
-                <w:shd w:fill="auto" w:val="clear"/>
-                <w:vertAlign w:val="baseline"/>
-              </w:rPr>
-              <w:t>}}</w:t>
+              <w:t>{{date}}</w:t>
             </w:r>
           </w:p>
         </w:tc>
@@ -3600,6 +3173,7 @@
     <w:qFormat/>
     <w:pPr>
       <w:widowControl/>
+      <w:suppressAutoHyphens w:val="true"/>
       <w:bidi w:val="0"/>
       <w:spacing w:lineRule="auto" w:line="276" w:before="0" w:after="200"/>
       <w:jc w:val="start"/>
@@ -3623,7 +3197,6 @@
       <w:keepLines/>
       <w:pageBreakBefore w:val="false"/>
       <w:widowControl/>
-      <w:pBdr/>
       <w:shd w:val="clear" w:fill="auto"/>
       <w:spacing w:lineRule="auto" w:line="240" w:before="480" w:after="120"/>
       <w:ind w:hanging="0" w:start="0" w:end="0"/>
@@ -3658,7 +3231,6 @@
       <w:keepLines/>
       <w:pageBreakBefore w:val="false"/>
       <w:widowControl/>
-      <w:pBdr/>
       <w:shd w:val="clear" w:fill="auto"/>
       <w:spacing w:lineRule="auto" w:line="240" w:before="360" w:after="80"/>
       <w:ind w:hanging="0" w:start="0" w:end="0"/>
@@ -3693,7 +3265,6 @@
       <w:keepLines/>
       <w:pageBreakBefore w:val="false"/>
       <w:widowControl/>
-      <w:pBdr/>
       <w:shd w:val="clear" w:fill="auto"/>
       <w:spacing w:lineRule="auto" w:line="240" w:before="280" w:after="80"/>
       <w:ind w:hanging="0" w:start="0" w:end="0"/>
@@ -3728,7 +3299,6 @@
       <w:keepLines/>
       <w:pageBreakBefore w:val="false"/>
       <w:widowControl/>
-      <w:pBdr/>
       <w:shd w:val="clear" w:fill="auto"/>
       <w:spacing w:lineRule="auto" w:line="240" w:before="240" w:after="40"/>
       <w:ind w:hanging="0" w:start="0" w:end="0"/>
@@ -3763,7 +3333,6 @@
       <w:keepLines/>
       <w:pageBreakBefore w:val="false"/>
       <w:widowControl/>
-      <w:pBdr/>
       <w:shd w:val="clear" w:fill="auto"/>
       <w:spacing w:lineRule="auto" w:line="240" w:before="220" w:after="40"/>
       <w:ind w:hanging="0" w:start="0" w:end="0"/>
@@ -3798,7 +3367,6 @@
       <w:keepLines/>
       <w:pageBreakBefore w:val="false"/>
       <w:widowControl/>
-      <w:pBdr/>
       <w:shd w:val="clear" w:fill="auto"/>
       <w:spacing w:lineRule="auto" w:line="240" w:before="200" w:after="40"/>
       <w:ind w:hanging="0" w:start="0" w:end="0"/>
@@ -3899,6 +3467,7 @@
     <w:qFormat/>
     <w:pPr>
       <w:widowControl/>
+      <w:suppressAutoHyphens w:val="true"/>
       <w:bidi w:val="0"/>
       <w:spacing w:lineRule="auto" w:line="276" w:before="0" w:after="200"/>
       <w:jc w:val="start"/>
@@ -3922,7 +3491,6 @@
       <w:keepLines/>
       <w:pageBreakBefore w:val="false"/>
       <w:widowControl/>
-      <w:pBdr/>
       <w:shd w:val="clear" w:fill="auto"/>
       <w:spacing w:lineRule="auto" w:line="240" w:before="480" w:after="120"/>
       <w:ind w:hanging="0" w:start="0" w:end="0"/>
@@ -3963,7 +3531,7 @@
       <w:kern w:val="0"/>
       <w:sz w:val="22"/>
       <w:szCs w:val="22"/>
-      <w:lang w:eastAsia="zh-CN" w:bidi="hi-IN" w:val="en-US"/>
+      <w:lang w:val="en-US" w:eastAsia="zh-CN" w:bidi="hi-IN"/>
     </w:rPr>
   </w:style>
   <w:style w:type="paragraph" w:styleId="ListParagraph">
@@ -3987,7 +3555,6 @@
       <w:keepLines/>
       <w:pageBreakBefore w:val="false"/>
       <w:widowControl/>
-      <w:pBdr/>
       <w:shd w:val="clear" w:fill="auto"/>
       <w:spacing w:lineRule="auto" w:line="240" w:before="360" w:after="80"/>
       <w:ind w:hanging="0" w:start="0" w:end="0"/>

</xml_diff>